<commit_message>
fix(justificativa): adicionar sectPr com headerReference no template DOCX
O sectPr foi perdido ao remover a seção de modo de preenchimento; sem ele
o Word não renderizava o cabeçalho com a logo ADESIAP.

Co-Authored-By: Claude Sonnet 4.6 <noreply@anthropic.com>
</commit_message>
<xml_diff>
--- a/justificativa-template.docx
+++ b/justificativa-template.docx
@@ -255,6 +255,14 @@
         </w:rPr>
       </w:pPr>
     </w:p>
+    <w:sectPr>
+      <w:headerReference w:type="default" r:id="rId10"/>
+      <w:footerReference w:type="default" r:id="rId11"/>
+      <w:pgSz w:w="11906" w:h="16838"/>
+      <w:pgMar w:top="1417" w:right="1701" w:bottom="1417" w:left="1701" w:header="708" w:footer="708" w:gutter="0"/>
+      <w:cols w:space="708"/>
+      <w:docGrid w:linePitch="360"/>
+    </w:sectPr>
   </w:body>
 </w:document>
 </file>

</xml_diff>